<commit_message>
docs: add use case specifications 6-21
Change-Id: I0000000000000000000000000000000000000005
</commit_message>
<xml_diff>
--- a/docs/use_case_specification/5.ssu-pretraga.docx
+++ b/docs/use_case_specification/5.ssu-pretraga.docx
@@ -245,17 +245,7 @@
           <w:szCs w:val="28"/>
           <w:lang w:val="sr-Latn-RS"/>
         </w:rPr>
-        <w:t>5.SSU</w:t>
-      </w:r>
-      <w:r>
-        <w:rPr>
-          <w:rFonts w:ascii="Space Grotesk" w:hAnsi="Space Grotesk"/>
-          <w:color w:val="808080"/>
-          <w:sz w:val="28"/>
-          <w:szCs w:val="28"/>
-          <w:lang w:val="sr-Latn-RS"/>
-        </w:rPr>
-        <w:t xml:space="preserve"> - Verzija 1.0</w:t>
+        <w:t>5.SSU - Verzija 1.0</w:t>
       </w:r>
     </w:p>
     <w:p>
@@ -329,8 +319,6 @@
         <w:jc w:val="right"/>
         <w:rPr>
           <w:rFonts w:ascii="Space Grotesk" w:hAnsi="Space Grotesk"/>
-          <w:b/>
-          <w:bCs/>
           <w:sz w:val="32"/>
           <w:szCs w:val="32"/>
           <w:lang w:val="sr-Latn-RS"/>
@@ -339,8 +327,6 @@
       <w:r>
         <w:rPr>
           <w:rFonts w:ascii="Space Grotesk" w:hAnsi="Space Grotesk"/>
-          <w:b/>
-          <w:bCs/>
           <w:sz w:val="32"/>
           <w:szCs w:val="32"/>
           <w:lang w:val="sr-Latn-RS"/>
@@ -364,260 +350,1038 @@
         <w:br w:type="page"/>
       </w:r>
     </w:p>
-    <w:p>
-      <w:pPr>
-        <w:pStyle w:val="PSISubtitle"/>
-        <w:numPr>
-          <w:ilvl w:val="0"/>
-          <w:numId w:val="0"/>
-        </w:numPr>
-        <w:spacing w:before="0"/>
-      </w:pPr>
-      <w:r>
-        <w:lastRenderedPageBreak/>
-        <w:t>Sadržaj</w:t>
-      </w:r>
-    </w:p>
-    <w:p>
-      <w:pPr>
-        <w:pStyle w:val="TOC1"/>
-      </w:pPr>
-      <w:r>
+    <w:sdt>
+      <w:sdtPr>
+        <w:id w:val="-919171253"/>
+        <w:docPartObj>
+          <w:docPartGallery w:val="Table of Contents"/>
+          <w:docPartUnique/>
+        </w:docPartObj>
+      </w:sdtPr>
+      <w:sdtEndPr>
         <w:rPr>
-          <w:rFonts w:ascii="Space Grotesk" w:hAnsi="Space Grotesk"/>
-          <w:lang w:val="sr-Latn-RS"/>
+          <w:rFonts w:asciiTheme="minorHAnsi" w:eastAsiaTheme="minorHAnsi" w:hAnsiTheme="minorHAnsi"/>
+          <w:b/>
+          <w:bCs/>
+          <w:color w:val="auto"/>
+          <w:sz w:val="24"/>
+          <w:lang w:val="en-GB"/>
         </w:rPr>
-        <w:t>1. Uvod</w:t>
-      </w:r>
-      <w:r>
-        <w:rPr>
-          <w:rFonts w:ascii="Space Grotesk" w:hAnsi="Space Grotesk"/>
-          <w:lang w:val="sr-Latn-RS"/>
-        </w:rPr>
-        <w:tab/>
-        <w:t>2</w:t>
-      </w:r>
-    </w:p>
-    <w:p>
-      <w:pPr>
-        <w:pStyle w:val="TOC2"/>
-      </w:pPr>
-      <w:r>
-        <w:rPr>
-          <w:rFonts w:ascii="Space Grotesk" w:hAnsi="Space Grotesk"/>
-          <w:lang w:val="sr-Latn-RS"/>
-        </w:rPr>
-        <w:t>1.1. Rezime</w:t>
-      </w:r>
-      <w:r>
-        <w:rPr>
-          <w:rFonts w:ascii="Space Grotesk" w:hAnsi="Space Grotesk"/>
-          <w:lang w:val="sr-Latn-RS"/>
-        </w:rPr>
-        <w:tab/>
-        <w:t>2</w:t>
-      </w:r>
-    </w:p>
-    <w:p>
-      <w:pPr>
-        <w:pStyle w:val="TOC2"/>
-      </w:pPr>
-      <w:r>
-        <w:rPr>
-          <w:rFonts w:ascii="Space Grotesk" w:hAnsi="Space Grotesk"/>
-          <w:lang w:val="sr-Latn-RS"/>
-        </w:rPr>
-        <w:t>1.2. Namena dokumenta i ciljne grupe</w:t>
-      </w:r>
-      <w:r>
-        <w:rPr>
-          <w:rFonts w:ascii="Space Grotesk" w:hAnsi="Space Grotesk"/>
-          <w:lang w:val="sr-Latn-RS"/>
-        </w:rPr>
-        <w:tab/>
-        <w:t>2</w:t>
-      </w:r>
-    </w:p>
-    <w:p>
-      <w:pPr>
-        <w:pStyle w:val="TOC2"/>
-      </w:pPr>
-      <w:r>
-        <w:rPr>
-          <w:rFonts w:ascii="Space Grotesk" w:hAnsi="Space Grotesk"/>
-          <w:lang w:val="sr-Latn-RS"/>
-        </w:rPr>
-        <w:t>1.3. Reference</w:t>
-      </w:r>
-      <w:r>
-        <w:rPr>
-          <w:rFonts w:ascii="Space Grotesk" w:hAnsi="Space Grotesk"/>
-          <w:lang w:val="sr-Latn-RS"/>
-        </w:rPr>
-        <w:tab/>
-        <w:t>2</w:t>
-      </w:r>
-    </w:p>
-    <w:p>
-      <w:pPr>
-        <w:pStyle w:val="TOC2"/>
-      </w:pPr>
-      <w:r>
-        <w:rPr>
-          <w:rFonts w:ascii="Space Grotesk" w:hAnsi="Space Grotesk"/>
-          <w:lang w:val="sr-Latn-RS"/>
-        </w:rPr>
-        <w:t>1.4. Otvorena pitanja</w:t>
-      </w:r>
-      <w:r>
-        <w:rPr>
-          <w:rFonts w:ascii="Space Grotesk" w:hAnsi="Space Grotesk"/>
-          <w:lang w:val="sr-Latn-RS"/>
-        </w:rPr>
-        <w:tab/>
-        <w:t>3</w:t>
-      </w:r>
-    </w:p>
-    <w:p>
-      <w:pPr>
-        <w:pStyle w:val="TOC1"/>
-      </w:pPr>
-      <w:r>
-        <w:rPr>
-          <w:rFonts w:ascii="Space Grotesk" w:hAnsi="Space Grotesk"/>
-          <w:lang w:val="sr-Latn-RS"/>
-        </w:rPr>
-        <w:t>2. Scenario pretrage</w:t>
-      </w:r>
-      <w:r>
-        <w:rPr>
-          <w:rFonts w:ascii="Space Grotesk" w:hAnsi="Space Grotesk"/>
-          <w:lang w:val="sr-Latn-RS"/>
-        </w:rPr>
-        <w:tab/>
-        <w:t>3</w:t>
-      </w:r>
-    </w:p>
-    <w:p>
-      <w:pPr>
-        <w:pStyle w:val="TOC2"/>
-      </w:pPr>
-      <w:r>
-        <w:rPr>
-          <w:rFonts w:ascii="Space Grotesk" w:hAnsi="Space Grotesk"/>
-          <w:lang w:val="sr-Latn-RS"/>
-        </w:rPr>
-        <w:t>2.1. Kratak opis</w:t>
-      </w:r>
-      <w:r>
-        <w:rPr>
-          <w:rFonts w:ascii="Space Grotesk" w:hAnsi="Space Grotesk"/>
-          <w:lang w:val="sr-Latn-RS"/>
-        </w:rPr>
-        <w:tab/>
-        <w:t>3</w:t>
-      </w:r>
-    </w:p>
-    <w:p>
-      <w:pPr>
-        <w:pStyle w:val="TOC2"/>
-      </w:pPr>
-      <w:r>
-        <w:rPr>
-          <w:rFonts w:ascii="Space Grotesk" w:hAnsi="Space Grotesk"/>
-          <w:lang w:val="sr-Latn-RS"/>
-        </w:rPr>
-        <w:t>2.2. Tok događaja</w:t>
-      </w:r>
-      <w:r>
-        <w:rPr>
-          <w:rFonts w:ascii="Space Grotesk" w:hAnsi="Space Grotesk"/>
-          <w:lang w:val="sr-Latn-RS"/>
-        </w:rPr>
-        <w:tab/>
-        <w:t>4</w:t>
-      </w:r>
-    </w:p>
-    <w:p>
-      <w:pPr>
-        <w:pStyle w:val="TOC2"/>
-      </w:pPr>
-      <w:r>
-        <w:rPr>
-          <w:rFonts w:ascii="Space Grotesk" w:hAnsi="Space Grotesk"/>
-          <w:lang w:val="sr-Latn-RS"/>
-        </w:rPr>
-        <w:t>2.3. Posebni zahtevi</w:t>
-      </w:r>
-      <w:r>
-        <w:rPr>
-          <w:rFonts w:ascii="Space Grotesk" w:hAnsi="Space Grotesk"/>
-          <w:lang w:val="sr-Latn-RS"/>
-        </w:rPr>
-        <w:tab/>
-        <w:t>6</w:t>
-      </w:r>
-    </w:p>
-    <w:p>
-      <w:pPr>
-        <w:pStyle w:val="TOC2"/>
-      </w:pPr>
-      <w:r>
-        <w:rPr>
-          <w:rFonts w:ascii="Space Grotesk" w:hAnsi="Space Grotesk"/>
-          <w:lang w:val="sr-Latn-RS"/>
-        </w:rPr>
-        <w:t>2.4. Preduslovi</w:t>
-      </w:r>
-      <w:r>
-        <w:rPr>
-          <w:rFonts w:ascii="Space Grotesk" w:hAnsi="Space Grotesk"/>
-          <w:lang w:val="sr-Latn-RS"/>
-        </w:rPr>
-        <w:tab/>
-        <w:t>6</w:t>
-      </w:r>
-    </w:p>
-    <w:p>
-      <w:pPr>
-        <w:pStyle w:val="TOC2"/>
-      </w:pPr>
-      <w:r>
-        <w:rPr>
-          <w:rFonts w:ascii="Space Grotesk" w:hAnsi="Space Grotesk"/>
-          <w:lang w:val="sr-Latn-RS"/>
-        </w:rPr>
-        <w:t>2.5. Posledice</w:t>
-      </w:r>
-      <w:r>
-        <w:rPr>
-          <w:rFonts w:ascii="Space Grotesk" w:hAnsi="Space Grotesk"/>
-          <w:lang w:val="sr-Latn-RS"/>
-        </w:rPr>
-        <w:tab/>
-        <w:t>7</w:t>
-      </w:r>
-    </w:p>
-    <w:p>
-      <w:pPr>
-        <w:pStyle w:val="TOC1"/>
-      </w:pPr>
-      <w:r>
-        <w:rPr>
-          <w:rFonts w:ascii="Space Grotesk" w:hAnsi="Space Grotesk"/>
-          <w:lang w:val="sr-Latn-RS"/>
-        </w:rPr>
-        <w:t>Verzije dokumenta</w:t>
-      </w:r>
-      <w:r>
-        <w:rPr>
-          <w:rFonts w:ascii="Space Grotesk" w:hAnsi="Space Grotesk"/>
-          <w:lang w:val="sr-Latn-RS"/>
-        </w:rPr>
-        <w:tab/>
-        <w:t>8</w:t>
-      </w:r>
-    </w:p>
+      </w:sdtEndPr>
+      <w:sdtContent>
+        <w:p>
+          <w:pPr>
+            <w:pStyle w:val="PSISubtitle"/>
+            <w:numPr>
+              <w:ilvl w:val="0"/>
+              <w:numId w:val="0"/>
+            </w:numPr>
+            <w:rPr>
+              <w:lang w:eastAsia="en-GB"/>
+            </w:rPr>
+          </w:pPr>
+          <w:r>
+            <w:t>Sadržaj</w:t>
+          </w:r>
+        </w:p>
+        <w:p>
+          <w:pPr>
+            <w:pStyle w:val="TOC1"/>
+            <w:tabs>
+              <w:tab w:val="left" w:pos="480"/>
+            </w:tabs>
+            <w:rPr>
+              <w:rFonts w:ascii="Space Grotesk" w:eastAsiaTheme="minorEastAsia" w:hAnsi="Space Grotesk"/>
+              <w:noProof/>
+              <w:lang w:eastAsia="en-GB"/>
+            </w:rPr>
+          </w:pPr>
+          <w:r>
+            <w:rPr>
+              <w:rFonts w:ascii="Space Grotesk" w:hAnsi="Space Grotesk"/>
+            </w:rPr>
+            <w:fldChar w:fldCharType="begin"/>
+          </w:r>
+          <w:r>
+            <w:rPr>
+              <w:rFonts w:ascii="Space Grotesk" w:hAnsi="Space Grotesk"/>
+            </w:rPr>
+            <w:instrText xml:space="preserve"> TOC \o "1-3" \h \z \u </w:instrText>
+          </w:r>
+          <w:r>
+            <w:rPr>
+              <w:rFonts w:ascii="Space Grotesk" w:hAnsi="Space Grotesk"/>
+            </w:rPr>
+            <w:fldChar w:fldCharType="separate"/>
+          </w:r>
+          <w:hyperlink w:anchor="_Toc230204254" w:history="1">
+            <w:r>
+              <w:rPr>
+                <w:rStyle w:val="Hyperlink"/>
+                <w:rFonts w:ascii="Space Grotesk" w:hAnsi="Space Grotesk"/>
+                <w:noProof/>
+              </w:rPr>
+              <w:t>1.</w:t>
+            </w:r>
+            <w:r>
+              <w:rPr>
+                <w:rFonts w:ascii="Space Grotesk" w:eastAsiaTheme="minorEastAsia" w:hAnsi="Space Grotesk"/>
+                <w:noProof/>
+                <w:lang w:eastAsia="en-GB"/>
+              </w:rPr>
+              <w:tab/>
+            </w:r>
+            <w:r>
+              <w:rPr>
+                <w:rStyle w:val="Hyperlink"/>
+                <w:rFonts w:ascii="Space Grotesk" w:hAnsi="Space Grotesk"/>
+                <w:noProof/>
+              </w:rPr>
+              <w:t>Uvod</w:t>
+            </w:r>
+            <w:r>
+              <w:rPr>
+                <w:rFonts w:ascii="Space Grotesk" w:hAnsi="Space Grotesk"/>
+                <w:noProof/>
+                <w:webHidden/>
+              </w:rPr>
+              <w:tab/>
+            </w:r>
+            <w:r>
+              <w:rPr>
+                <w:rFonts w:ascii="Space Grotesk" w:hAnsi="Space Grotesk"/>
+                <w:noProof/>
+                <w:webHidden/>
+              </w:rPr>
+              <w:fldChar w:fldCharType="begin"/>
+            </w:r>
+            <w:r>
+              <w:rPr>
+                <w:rFonts w:ascii="Space Grotesk" w:hAnsi="Space Grotesk"/>
+                <w:noProof/>
+                <w:webHidden/>
+              </w:rPr>
+              <w:instrText xml:space="preserve"> PAGEREF _Toc230204254 \h </w:instrText>
+            </w:r>
+            <w:r>
+              <w:rPr>
+                <w:rFonts w:ascii="Space Grotesk" w:hAnsi="Space Grotesk"/>
+                <w:noProof/>
+                <w:webHidden/>
+              </w:rPr>
+            </w:r>
+            <w:r>
+              <w:rPr>
+                <w:rFonts w:ascii="Space Grotesk" w:hAnsi="Space Grotesk"/>
+                <w:noProof/>
+                <w:webHidden/>
+              </w:rPr>
+              <w:fldChar w:fldCharType="separate"/>
+            </w:r>
+            <w:r>
+              <w:rPr>
+                <w:rFonts w:ascii="Space Grotesk" w:hAnsi="Space Grotesk"/>
+                <w:noProof/>
+                <w:webHidden/>
+              </w:rPr>
+              <w:t>3</w:t>
+            </w:r>
+            <w:r>
+              <w:rPr>
+                <w:rFonts w:ascii="Space Grotesk" w:hAnsi="Space Grotesk"/>
+                <w:noProof/>
+                <w:webHidden/>
+              </w:rPr>
+              <w:fldChar w:fldCharType="end"/>
+            </w:r>
+          </w:hyperlink>
+        </w:p>
+        <w:p>
+          <w:pPr>
+            <w:pStyle w:val="TOC2"/>
+            <w:tabs>
+              <w:tab w:val="right" w:leader="dot" w:pos="9062"/>
+            </w:tabs>
+            <w:rPr>
+              <w:rFonts w:ascii="Space Grotesk" w:eastAsiaTheme="minorEastAsia" w:hAnsi="Space Grotesk"/>
+              <w:noProof/>
+              <w:lang w:eastAsia="en-GB"/>
+            </w:rPr>
+          </w:pPr>
+          <w:hyperlink w:anchor="_Toc230204255" w:history="1">
+            <w:r>
+              <w:rPr>
+                <w:rStyle w:val="Hyperlink"/>
+                <w:rFonts w:ascii="Space Grotesk" w:hAnsi="Space Grotesk"/>
+                <w:noProof/>
+              </w:rPr>
+              <w:t>1.1. Rezime</w:t>
+            </w:r>
+            <w:r>
+              <w:rPr>
+                <w:rFonts w:ascii="Space Grotesk" w:hAnsi="Space Grotesk"/>
+                <w:noProof/>
+                <w:webHidden/>
+              </w:rPr>
+              <w:tab/>
+            </w:r>
+            <w:r>
+              <w:rPr>
+                <w:rFonts w:ascii="Space Grotesk" w:hAnsi="Space Grotesk"/>
+                <w:noProof/>
+                <w:webHidden/>
+              </w:rPr>
+              <w:fldChar w:fldCharType="begin"/>
+            </w:r>
+            <w:r>
+              <w:rPr>
+                <w:rFonts w:ascii="Space Grotesk" w:hAnsi="Space Grotesk"/>
+                <w:noProof/>
+                <w:webHidden/>
+              </w:rPr>
+              <w:instrText xml:space="preserve"> PAGEREF _Toc230204255 \h </w:instrText>
+            </w:r>
+            <w:r>
+              <w:rPr>
+                <w:rFonts w:ascii="Space Grotesk" w:hAnsi="Space Grotesk"/>
+                <w:noProof/>
+                <w:webHidden/>
+              </w:rPr>
+            </w:r>
+            <w:r>
+              <w:rPr>
+                <w:rFonts w:ascii="Space Grotesk" w:hAnsi="Space Grotesk"/>
+                <w:noProof/>
+                <w:webHidden/>
+              </w:rPr>
+              <w:fldChar w:fldCharType="separate"/>
+            </w:r>
+            <w:r>
+              <w:rPr>
+                <w:rFonts w:ascii="Space Grotesk" w:hAnsi="Space Grotesk"/>
+                <w:noProof/>
+                <w:webHidden/>
+              </w:rPr>
+              <w:t>3</w:t>
+            </w:r>
+            <w:r>
+              <w:rPr>
+                <w:rFonts w:ascii="Space Grotesk" w:hAnsi="Space Grotesk"/>
+                <w:noProof/>
+                <w:webHidden/>
+              </w:rPr>
+              <w:fldChar w:fldCharType="end"/>
+            </w:r>
+          </w:hyperlink>
+        </w:p>
+        <w:p>
+          <w:pPr>
+            <w:pStyle w:val="TOC2"/>
+            <w:tabs>
+              <w:tab w:val="right" w:leader="dot" w:pos="9062"/>
+            </w:tabs>
+            <w:rPr>
+              <w:rFonts w:ascii="Space Grotesk" w:eastAsiaTheme="minorEastAsia" w:hAnsi="Space Grotesk"/>
+              <w:noProof/>
+              <w:lang w:eastAsia="en-GB"/>
+            </w:rPr>
+          </w:pPr>
+          <w:hyperlink w:anchor="_Toc230204256" w:history="1">
+            <w:r>
+              <w:rPr>
+                <w:rStyle w:val="Hyperlink"/>
+                <w:rFonts w:ascii="Space Grotesk" w:hAnsi="Space Grotesk"/>
+                <w:noProof/>
+              </w:rPr>
+              <w:t>1.2. Namena dokumenta i ciljne grupe</w:t>
+            </w:r>
+            <w:r>
+              <w:rPr>
+                <w:rFonts w:ascii="Space Grotesk" w:hAnsi="Space Grotesk"/>
+                <w:noProof/>
+                <w:webHidden/>
+              </w:rPr>
+              <w:tab/>
+            </w:r>
+            <w:r>
+              <w:rPr>
+                <w:rFonts w:ascii="Space Grotesk" w:hAnsi="Space Grotesk"/>
+                <w:noProof/>
+                <w:webHidden/>
+              </w:rPr>
+              <w:fldChar w:fldCharType="begin"/>
+            </w:r>
+            <w:r>
+              <w:rPr>
+                <w:rFonts w:ascii="Space Grotesk" w:hAnsi="Space Grotesk"/>
+                <w:noProof/>
+                <w:webHidden/>
+              </w:rPr>
+              <w:instrText xml:space="preserve"> PAGEREF _Toc230204256 \h </w:instrText>
+            </w:r>
+            <w:r>
+              <w:rPr>
+                <w:rFonts w:ascii="Space Grotesk" w:hAnsi="Space Grotesk"/>
+                <w:noProof/>
+                <w:webHidden/>
+              </w:rPr>
+            </w:r>
+            <w:r>
+              <w:rPr>
+                <w:rFonts w:ascii="Space Grotesk" w:hAnsi="Space Grotesk"/>
+                <w:noProof/>
+                <w:webHidden/>
+              </w:rPr>
+              <w:fldChar w:fldCharType="separate"/>
+            </w:r>
+            <w:r>
+              <w:rPr>
+                <w:rFonts w:ascii="Space Grotesk" w:hAnsi="Space Grotesk"/>
+                <w:noProof/>
+                <w:webHidden/>
+              </w:rPr>
+              <w:t>3</w:t>
+            </w:r>
+            <w:r>
+              <w:rPr>
+                <w:rFonts w:ascii="Space Grotesk" w:hAnsi="Space Grotesk"/>
+                <w:noProof/>
+                <w:webHidden/>
+              </w:rPr>
+              <w:fldChar w:fldCharType="end"/>
+            </w:r>
+          </w:hyperlink>
+        </w:p>
+        <w:p>
+          <w:pPr>
+            <w:pStyle w:val="TOC2"/>
+            <w:tabs>
+              <w:tab w:val="right" w:leader="dot" w:pos="9062"/>
+            </w:tabs>
+            <w:rPr>
+              <w:rFonts w:ascii="Space Grotesk" w:eastAsiaTheme="minorEastAsia" w:hAnsi="Space Grotesk"/>
+              <w:noProof/>
+              <w:lang w:eastAsia="en-GB"/>
+            </w:rPr>
+          </w:pPr>
+          <w:hyperlink w:anchor="_Toc230204257" w:history="1">
+            <w:r>
+              <w:rPr>
+                <w:rStyle w:val="Hyperlink"/>
+                <w:rFonts w:ascii="Space Grotesk" w:hAnsi="Space Grotesk"/>
+                <w:noProof/>
+              </w:rPr>
+              <w:t>1.3. Reference</w:t>
+            </w:r>
+            <w:r>
+              <w:rPr>
+                <w:rFonts w:ascii="Space Grotesk" w:hAnsi="Space Grotesk"/>
+                <w:noProof/>
+                <w:webHidden/>
+              </w:rPr>
+              <w:tab/>
+            </w:r>
+            <w:r>
+              <w:rPr>
+                <w:rFonts w:ascii="Space Grotesk" w:hAnsi="Space Grotesk"/>
+                <w:noProof/>
+                <w:webHidden/>
+              </w:rPr>
+              <w:fldChar w:fldCharType="begin"/>
+            </w:r>
+            <w:r>
+              <w:rPr>
+                <w:rFonts w:ascii="Space Grotesk" w:hAnsi="Space Grotesk"/>
+                <w:noProof/>
+                <w:webHidden/>
+              </w:rPr>
+              <w:instrText xml:space="preserve"> PAGEREF _Toc230204257 \h </w:instrText>
+            </w:r>
+            <w:r>
+              <w:rPr>
+                <w:rFonts w:ascii="Space Grotesk" w:hAnsi="Space Grotesk"/>
+                <w:noProof/>
+                <w:webHidden/>
+              </w:rPr>
+            </w:r>
+            <w:r>
+              <w:rPr>
+                <w:rFonts w:ascii="Space Grotesk" w:hAnsi="Space Grotesk"/>
+                <w:noProof/>
+                <w:webHidden/>
+              </w:rPr>
+              <w:fldChar w:fldCharType="separate"/>
+            </w:r>
+            <w:r>
+              <w:rPr>
+                <w:rFonts w:ascii="Space Grotesk" w:hAnsi="Space Grotesk"/>
+                <w:noProof/>
+                <w:webHidden/>
+              </w:rPr>
+              <w:t>3</w:t>
+            </w:r>
+            <w:r>
+              <w:rPr>
+                <w:rFonts w:ascii="Space Grotesk" w:hAnsi="Space Grotesk"/>
+                <w:noProof/>
+                <w:webHidden/>
+              </w:rPr>
+              <w:fldChar w:fldCharType="end"/>
+            </w:r>
+          </w:hyperlink>
+        </w:p>
+        <w:p>
+          <w:pPr>
+            <w:pStyle w:val="TOC2"/>
+            <w:tabs>
+              <w:tab w:val="right" w:leader="dot" w:pos="9062"/>
+            </w:tabs>
+            <w:rPr>
+              <w:rFonts w:ascii="Space Grotesk" w:eastAsiaTheme="minorEastAsia" w:hAnsi="Space Grotesk"/>
+              <w:noProof/>
+              <w:lang w:eastAsia="en-GB"/>
+            </w:rPr>
+          </w:pPr>
+          <w:hyperlink w:anchor="_Toc230204258" w:history="1">
+            <w:r>
+              <w:rPr>
+                <w:rStyle w:val="Hyperlink"/>
+                <w:rFonts w:ascii="Space Grotesk" w:hAnsi="Space Grotesk"/>
+                <w:noProof/>
+              </w:rPr>
+              <w:t>1.4. Otvorena pitanja</w:t>
+            </w:r>
+            <w:r>
+              <w:rPr>
+                <w:rFonts w:ascii="Space Grotesk" w:hAnsi="Space Grotesk"/>
+                <w:noProof/>
+                <w:webHidden/>
+              </w:rPr>
+              <w:tab/>
+            </w:r>
+            <w:r>
+              <w:rPr>
+                <w:rFonts w:ascii="Space Grotesk" w:hAnsi="Space Grotesk"/>
+                <w:noProof/>
+                <w:webHidden/>
+              </w:rPr>
+              <w:fldChar w:fldCharType="begin"/>
+            </w:r>
+            <w:r>
+              <w:rPr>
+                <w:rFonts w:ascii="Space Grotesk" w:hAnsi="Space Grotesk"/>
+                <w:noProof/>
+                <w:webHidden/>
+              </w:rPr>
+              <w:instrText xml:space="preserve"> PAGEREF _Toc230204258 \h </w:instrText>
+            </w:r>
+            <w:r>
+              <w:rPr>
+                <w:rFonts w:ascii="Space Grotesk" w:hAnsi="Space Grotesk"/>
+                <w:noProof/>
+                <w:webHidden/>
+              </w:rPr>
+            </w:r>
+            <w:r>
+              <w:rPr>
+                <w:rFonts w:ascii="Space Grotesk" w:hAnsi="Space Grotesk"/>
+                <w:noProof/>
+                <w:webHidden/>
+              </w:rPr>
+              <w:fldChar w:fldCharType="separate"/>
+            </w:r>
+            <w:r>
+              <w:rPr>
+                <w:rFonts w:ascii="Space Grotesk" w:hAnsi="Space Grotesk"/>
+                <w:noProof/>
+                <w:webHidden/>
+              </w:rPr>
+              <w:t>3</w:t>
+            </w:r>
+            <w:r>
+              <w:rPr>
+                <w:rFonts w:ascii="Space Grotesk" w:hAnsi="Space Grotesk"/>
+                <w:noProof/>
+                <w:webHidden/>
+              </w:rPr>
+              <w:fldChar w:fldCharType="end"/>
+            </w:r>
+          </w:hyperlink>
+        </w:p>
+        <w:p>
+          <w:pPr>
+            <w:pStyle w:val="TOC1"/>
+            <w:tabs>
+              <w:tab w:val="left" w:pos="480"/>
+            </w:tabs>
+            <w:rPr>
+              <w:rFonts w:ascii="Space Grotesk" w:eastAsiaTheme="minorEastAsia" w:hAnsi="Space Grotesk"/>
+              <w:noProof/>
+              <w:lang w:eastAsia="en-GB"/>
+            </w:rPr>
+          </w:pPr>
+          <w:hyperlink w:anchor="_Toc230204259" w:history="1">
+            <w:r>
+              <w:rPr>
+                <w:rStyle w:val="Hyperlink"/>
+                <w:rFonts w:ascii="Space Grotesk" w:hAnsi="Space Grotesk"/>
+                <w:noProof/>
+              </w:rPr>
+              <w:t>2.</w:t>
+            </w:r>
+            <w:r>
+              <w:rPr>
+                <w:rFonts w:ascii="Space Grotesk" w:eastAsiaTheme="minorEastAsia" w:hAnsi="Space Grotesk"/>
+                <w:noProof/>
+                <w:lang w:eastAsia="en-GB"/>
+              </w:rPr>
+              <w:tab/>
+            </w:r>
+            <w:r>
+              <w:rPr>
+                <w:rStyle w:val="Hyperlink"/>
+                <w:rFonts w:ascii="Space Grotesk" w:hAnsi="Space Grotesk"/>
+                <w:noProof/>
+              </w:rPr>
+              <w:t>Scenario pretrage</w:t>
+            </w:r>
+            <w:r>
+              <w:rPr>
+                <w:rFonts w:ascii="Space Grotesk" w:hAnsi="Space Grotesk"/>
+                <w:noProof/>
+                <w:webHidden/>
+              </w:rPr>
+              <w:tab/>
+            </w:r>
+            <w:r>
+              <w:rPr>
+                <w:rFonts w:ascii="Space Grotesk" w:hAnsi="Space Grotesk"/>
+                <w:noProof/>
+                <w:webHidden/>
+              </w:rPr>
+              <w:fldChar w:fldCharType="begin"/>
+            </w:r>
+            <w:r>
+              <w:rPr>
+                <w:rFonts w:ascii="Space Grotesk" w:hAnsi="Space Grotesk"/>
+                <w:noProof/>
+                <w:webHidden/>
+              </w:rPr>
+              <w:instrText xml:space="preserve"> PAGEREF _Toc230204259 \h </w:instrText>
+            </w:r>
+            <w:r>
+              <w:rPr>
+                <w:rFonts w:ascii="Space Grotesk" w:hAnsi="Space Grotesk"/>
+                <w:noProof/>
+                <w:webHidden/>
+              </w:rPr>
+            </w:r>
+            <w:r>
+              <w:rPr>
+                <w:rFonts w:ascii="Space Grotesk" w:hAnsi="Space Grotesk"/>
+                <w:noProof/>
+                <w:webHidden/>
+              </w:rPr>
+              <w:fldChar w:fldCharType="separate"/>
+            </w:r>
+            <w:r>
+              <w:rPr>
+                <w:rFonts w:ascii="Space Grotesk" w:hAnsi="Space Grotesk"/>
+                <w:noProof/>
+                <w:webHidden/>
+              </w:rPr>
+              <w:t>3</w:t>
+            </w:r>
+            <w:r>
+              <w:rPr>
+                <w:rFonts w:ascii="Space Grotesk" w:hAnsi="Space Grotesk"/>
+                <w:noProof/>
+                <w:webHidden/>
+              </w:rPr>
+              <w:fldChar w:fldCharType="end"/>
+            </w:r>
+          </w:hyperlink>
+        </w:p>
+        <w:p>
+          <w:pPr>
+            <w:pStyle w:val="TOC2"/>
+            <w:tabs>
+              <w:tab w:val="right" w:leader="dot" w:pos="9062"/>
+            </w:tabs>
+            <w:rPr>
+              <w:rFonts w:ascii="Space Grotesk" w:eastAsiaTheme="minorEastAsia" w:hAnsi="Space Grotesk"/>
+              <w:noProof/>
+              <w:lang w:eastAsia="en-GB"/>
+            </w:rPr>
+          </w:pPr>
+          <w:hyperlink w:anchor="_Toc230204260" w:history="1">
+            <w:r>
+              <w:rPr>
+                <w:rStyle w:val="Hyperlink"/>
+                <w:rFonts w:ascii="Space Grotesk" w:hAnsi="Space Grotesk"/>
+                <w:noProof/>
+              </w:rPr>
+              <w:t>2.1. Kratak opis</w:t>
+            </w:r>
+            <w:r>
+              <w:rPr>
+                <w:rFonts w:ascii="Space Grotesk" w:hAnsi="Space Grotesk"/>
+                <w:noProof/>
+                <w:webHidden/>
+              </w:rPr>
+              <w:tab/>
+            </w:r>
+            <w:r>
+              <w:rPr>
+                <w:rFonts w:ascii="Space Grotesk" w:hAnsi="Space Grotesk"/>
+                <w:noProof/>
+                <w:webHidden/>
+              </w:rPr>
+              <w:fldChar w:fldCharType="begin"/>
+            </w:r>
+            <w:r>
+              <w:rPr>
+                <w:rFonts w:ascii="Space Grotesk" w:hAnsi="Space Grotesk"/>
+                <w:noProof/>
+                <w:webHidden/>
+              </w:rPr>
+              <w:instrText xml:space="preserve"> PAGEREF _Toc230204260 \h </w:instrText>
+            </w:r>
+            <w:r>
+              <w:rPr>
+                <w:rFonts w:ascii="Space Grotesk" w:hAnsi="Space Grotesk"/>
+                <w:noProof/>
+                <w:webHidden/>
+              </w:rPr>
+            </w:r>
+            <w:r>
+              <w:rPr>
+                <w:rFonts w:ascii="Space Grotesk" w:hAnsi="Space Grotesk"/>
+                <w:noProof/>
+                <w:webHidden/>
+              </w:rPr>
+              <w:fldChar w:fldCharType="separate"/>
+            </w:r>
+            <w:r>
+              <w:rPr>
+                <w:rFonts w:ascii="Space Grotesk" w:hAnsi="Space Grotesk"/>
+                <w:noProof/>
+                <w:webHidden/>
+              </w:rPr>
+              <w:t>3</w:t>
+            </w:r>
+            <w:r>
+              <w:rPr>
+                <w:rFonts w:ascii="Space Grotesk" w:hAnsi="Space Grotesk"/>
+                <w:noProof/>
+                <w:webHidden/>
+              </w:rPr>
+              <w:fldChar w:fldCharType="end"/>
+            </w:r>
+          </w:hyperlink>
+        </w:p>
+        <w:p>
+          <w:pPr>
+            <w:pStyle w:val="TOC2"/>
+            <w:tabs>
+              <w:tab w:val="right" w:leader="dot" w:pos="9062"/>
+            </w:tabs>
+            <w:rPr>
+              <w:rFonts w:ascii="Space Grotesk" w:eastAsiaTheme="minorEastAsia" w:hAnsi="Space Grotesk"/>
+              <w:noProof/>
+              <w:lang w:eastAsia="en-GB"/>
+            </w:rPr>
+          </w:pPr>
+          <w:hyperlink w:anchor="_Toc230204261" w:history="1">
+            <w:r>
+              <w:rPr>
+                <w:rStyle w:val="Hyperlink"/>
+                <w:rFonts w:ascii="Space Grotesk" w:hAnsi="Space Grotesk"/>
+                <w:noProof/>
+              </w:rPr>
+              <w:t>2.2. Tok događaja</w:t>
+            </w:r>
+            <w:r>
+              <w:rPr>
+                <w:rFonts w:ascii="Space Grotesk" w:hAnsi="Space Grotesk"/>
+                <w:noProof/>
+                <w:webHidden/>
+              </w:rPr>
+              <w:tab/>
+            </w:r>
+            <w:r>
+              <w:rPr>
+                <w:rFonts w:ascii="Space Grotesk" w:hAnsi="Space Grotesk"/>
+                <w:noProof/>
+                <w:webHidden/>
+              </w:rPr>
+              <w:fldChar w:fldCharType="begin"/>
+            </w:r>
+            <w:r>
+              <w:rPr>
+                <w:rFonts w:ascii="Space Grotesk" w:hAnsi="Space Grotesk"/>
+                <w:noProof/>
+                <w:webHidden/>
+              </w:rPr>
+              <w:instrText xml:space="preserve"> PAGEREF _Toc230204261 \h </w:instrText>
+            </w:r>
+            <w:r>
+              <w:rPr>
+                <w:rFonts w:ascii="Space Grotesk" w:hAnsi="Space Grotesk"/>
+                <w:noProof/>
+                <w:webHidden/>
+              </w:rPr>
+            </w:r>
+            <w:r>
+              <w:rPr>
+                <w:rFonts w:ascii="Space Grotesk" w:hAnsi="Space Grotesk"/>
+                <w:noProof/>
+                <w:webHidden/>
+              </w:rPr>
+              <w:fldChar w:fldCharType="separate"/>
+            </w:r>
+            <w:r>
+              <w:rPr>
+                <w:rFonts w:ascii="Space Grotesk" w:hAnsi="Space Grotesk"/>
+                <w:noProof/>
+                <w:webHidden/>
+              </w:rPr>
+              <w:t>4</w:t>
+            </w:r>
+            <w:r>
+              <w:rPr>
+                <w:rFonts w:ascii="Space Grotesk" w:hAnsi="Space Grotesk"/>
+                <w:noProof/>
+                <w:webHidden/>
+              </w:rPr>
+              <w:fldChar w:fldCharType="end"/>
+            </w:r>
+          </w:hyperlink>
+        </w:p>
+        <w:p>
+          <w:pPr>
+            <w:pStyle w:val="TOC2"/>
+            <w:tabs>
+              <w:tab w:val="right" w:leader="dot" w:pos="9062"/>
+            </w:tabs>
+            <w:rPr>
+              <w:rFonts w:ascii="Space Grotesk" w:eastAsiaTheme="minorEastAsia" w:hAnsi="Space Grotesk"/>
+              <w:noProof/>
+              <w:lang w:eastAsia="en-GB"/>
+            </w:rPr>
+          </w:pPr>
+          <w:hyperlink w:anchor="_Toc230204266" w:history="1">
+            <w:r>
+              <w:rPr>
+                <w:rStyle w:val="Hyperlink"/>
+                <w:rFonts w:ascii="Space Grotesk" w:hAnsi="Space Grotesk"/>
+                <w:noProof/>
+              </w:rPr>
+              <w:t>2.3. Posebni zahtevi</w:t>
+            </w:r>
+            <w:r>
+              <w:rPr>
+                <w:rFonts w:ascii="Space Grotesk" w:hAnsi="Space Grotesk"/>
+                <w:noProof/>
+                <w:webHidden/>
+              </w:rPr>
+              <w:tab/>
+            </w:r>
+            <w:r>
+              <w:rPr>
+                <w:rFonts w:ascii="Space Grotesk" w:hAnsi="Space Grotesk"/>
+                <w:noProof/>
+                <w:webHidden/>
+              </w:rPr>
+              <w:fldChar w:fldCharType="begin"/>
+            </w:r>
+            <w:r>
+              <w:rPr>
+                <w:rFonts w:ascii="Space Grotesk" w:hAnsi="Space Grotesk"/>
+                <w:noProof/>
+                <w:webHidden/>
+              </w:rPr>
+              <w:instrText xml:space="preserve"> PAGEREF _Toc230204266 \h </w:instrText>
+            </w:r>
+            <w:r>
+              <w:rPr>
+                <w:rFonts w:ascii="Space Grotesk" w:hAnsi="Space Grotesk"/>
+                <w:noProof/>
+                <w:webHidden/>
+              </w:rPr>
+            </w:r>
+            <w:r>
+              <w:rPr>
+                <w:rFonts w:ascii="Space Grotesk" w:hAnsi="Space Grotesk"/>
+                <w:noProof/>
+                <w:webHidden/>
+              </w:rPr>
+              <w:fldChar w:fldCharType="separate"/>
+            </w:r>
+            <w:r>
+              <w:rPr>
+                <w:rFonts w:ascii="Space Grotesk" w:hAnsi="Space Grotesk"/>
+                <w:noProof/>
+                <w:webHidden/>
+              </w:rPr>
+              <w:t>5</w:t>
+            </w:r>
+            <w:r>
+              <w:rPr>
+                <w:rFonts w:ascii="Space Grotesk" w:hAnsi="Space Grotesk"/>
+                <w:noProof/>
+                <w:webHidden/>
+              </w:rPr>
+              <w:fldChar w:fldCharType="end"/>
+            </w:r>
+          </w:hyperlink>
+        </w:p>
+        <w:p>
+          <w:pPr>
+            <w:pStyle w:val="TOC2"/>
+            <w:tabs>
+              <w:tab w:val="right" w:leader="dot" w:pos="9062"/>
+            </w:tabs>
+            <w:rPr>
+              <w:rFonts w:ascii="Space Grotesk" w:eastAsiaTheme="minorEastAsia" w:hAnsi="Space Grotesk"/>
+              <w:noProof/>
+              <w:lang w:eastAsia="en-GB"/>
+            </w:rPr>
+          </w:pPr>
+          <w:hyperlink w:anchor="_Toc230204267" w:history="1">
+            <w:r>
+              <w:rPr>
+                <w:rStyle w:val="Hyperlink"/>
+                <w:rFonts w:ascii="Space Grotesk" w:hAnsi="Space Grotesk"/>
+                <w:noProof/>
+              </w:rPr>
+              <w:t>2.4. Preduslovi</w:t>
+            </w:r>
+            <w:r>
+              <w:rPr>
+                <w:rFonts w:ascii="Space Grotesk" w:hAnsi="Space Grotesk"/>
+                <w:noProof/>
+                <w:webHidden/>
+              </w:rPr>
+              <w:tab/>
+            </w:r>
+            <w:r>
+              <w:rPr>
+                <w:rFonts w:ascii="Space Grotesk" w:hAnsi="Space Grotesk"/>
+                <w:noProof/>
+                <w:webHidden/>
+              </w:rPr>
+              <w:fldChar w:fldCharType="begin"/>
+            </w:r>
+            <w:r>
+              <w:rPr>
+                <w:rFonts w:ascii="Space Grotesk" w:hAnsi="Space Grotesk"/>
+                <w:noProof/>
+                <w:webHidden/>
+              </w:rPr>
+              <w:instrText xml:space="preserve"> PAGEREF _Toc230204267 \h </w:instrText>
+            </w:r>
+            <w:r>
+              <w:rPr>
+                <w:rFonts w:ascii="Space Grotesk" w:hAnsi="Space Grotesk"/>
+                <w:noProof/>
+                <w:webHidden/>
+              </w:rPr>
+            </w:r>
+            <w:r>
+              <w:rPr>
+                <w:rFonts w:ascii="Space Grotesk" w:hAnsi="Space Grotesk"/>
+                <w:noProof/>
+                <w:webHidden/>
+              </w:rPr>
+              <w:fldChar w:fldCharType="separate"/>
+            </w:r>
+            <w:r>
+              <w:rPr>
+                <w:rFonts w:ascii="Space Grotesk" w:hAnsi="Space Grotesk"/>
+                <w:noProof/>
+                <w:webHidden/>
+              </w:rPr>
+              <w:t>5</w:t>
+            </w:r>
+            <w:r>
+              <w:rPr>
+                <w:rFonts w:ascii="Space Grotesk" w:hAnsi="Space Grotesk"/>
+                <w:noProof/>
+                <w:webHidden/>
+              </w:rPr>
+              <w:fldChar w:fldCharType="end"/>
+            </w:r>
+          </w:hyperlink>
+        </w:p>
+        <w:p>
+          <w:pPr>
+            <w:pStyle w:val="TOC2"/>
+            <w:tabs>
+              <w:tab w:val="right" w:leader="dot" w:pos="9062"/>
+            </w:tabs>
+            <w:rPr>
+              <w:rFonts w:ascii="Space Grotesk" w:eastAsiaTheme="minorEastAsia" w:hAnsi="Space Grotesk"/>
+              <w:noProof/>
+              <w:lang w:eastAsia="en-GB"/>
+            </w:rPr>
+          </w:pPr>
+          <w:hyperlink w:anchor="_Toc230204268" w:history="1">
+            <w:r>
+              <w:rPr>
+                <w:rStyle w:val="Hyperlink"/>
+                <w:rFonts w:ascii="Space Grotesk" w:hAnsi="Space Grotesk"/>
+                <w:noProof/>
+              </w:rPr>
+              <w:t>2.5. Posledice</w:t>
+            </w:r>
+            <w:r>
+              <w:rPr>
+                <w:rFonts w:ascii="Space Grotesk" w:hAnsi="Space Grotesk"/>
+                <w:noProof/>
+                <w:webHidden/>
+              </w:rPr>
+              <w:tab/>
+            </w:r>
+            <w:r>
+              <w:rPr>
+                <w:rFonts w:ascii="Space Grotesk" w:hAnsi="Space Grotesk"/>
+                <w:noProof/>
+                <w:webHidden/>
+              </w:rPr>
+              <w:fldChar w:fldCharType="begin"/>
+            </w:r>
+            <w:r>
+              <w:rPr>
+                <w:rFonts w:ascii="Space Grotesk" w:hAnsi="Space Grotesk"/>
+                <w:noProof/>
+                <w:webHidden/>
+              </w:rPr>
+              <w:instrText xml:space="preserve"> PAGEREF _Toc230204268 \h </w:instrText>
+            </w:r>
+            <w:r>
+              <w:rPr>
+                <w:rFonts w:ascii="Space Grotesk" w:hAnsi="Space Grotesk"/>
+                <w:noProof/>
+                <w:webHidden/>
+              </w:rPr>
+            </w:r>
+            <w:r>
+              <w:rPr>
+                <w:rFonts w:ascii="Space Grotesk" w:hAnsi="Space Grotesk"/>
+                <w:noProof/>
+                <w:webHidden/>
+              </w:rPr>
+              <w:fldChar w:fldCharType="separate"/>
+            </w:r>
+            <w:r>
+              <w:rPr>
+                <w:rFonts w:ascii="Space Grotesk" w:hAnsi="Space Grotesk"/>
+                <w:noProof/>
+                <w:webHidden/>
+              </w:rPr>
+              <w:t>5</w:t>
+            </w:r>
+            <w:r>
+              <w:rPr>
+                <w:rFonts w:ascii="Space Grotesk" w:hAnsi="Space Grotesk"/>
+                <w:noProof/>
+                <w:webHidden/>
+              </w:rPr>
+              <w:fldChar w:fldCharType="end"/>
+            </w:r>
+          </w:hyperlink>
+        </w:p>
+        <w:p>
+          <w:pPr>
+            <w:pStyle w:val="TOC2"/>
+            <w:tabs>
+              <w:tab w:val="right" w:leader="dot" w:pos="9062"/>
+            </w:tabs>
+            <w:rPr>
+              <w:rFonts w:ascii="Space Grotesk" w:eastAsiaTheme="minorEastAsia" w:hAnsi="Space Grotesk"/>
+              <w:noProof/>
+              <w:lang w:eastAsia="en-GB"/>
+            </w:rPr>
+          </w:pPr>
+          <w:hyperlink w:anchor="_Toc230204269" w:history="1">
+            <w:r>
+              <w:rPr>
+                <w:rStyle w:val="Hyperlink"/>
+                <w:rFonts w:ascii="Space Grotesk" w:hAnsi="Space Grotesk"/>
+                <w:noProof/>
+              </w:rPr>
+              <w:t>Verzije dokumenta</w:t>
+            </w:r>
+            <w:r>
+              <w:rPr>
+                <w:rFonts w:ascii="Space Grotesk" w:hAnsi="Space Grotesk"/>
+                <w:noProof/>
+                <w:webHidden/>
+              </w:rPr>
+              <w:tab/>
+            </w:r>
+            <w:r>
+              <w:rPr>
+                <w:rFonts w:ascii="Space Grotesk" w:hAnsi="Space Grotesk"/>
+                <w:noProof/>
+                <w:webHidden/>
+              </w:rPr>
+              <w:fldChar w:fldCharType="begin"/>
+            </w:r>
+            <w:r>
+              <w:rPr>
+                <w:rFonts w:ascii="Space Grotesk" w:hAnsi="Space Grotesk"/>
+                <w:noProof/>
+                <w:webHidden/>
+              </w:rPr>
+              <w:instrText xml:space="preserve"> PAGEREF _Toc230204269 \h </w:instrText>
+            </w:r>
+            <w:r>
+              <w:rPr>
+                <w:rFonts w:ascii="Space Grotesk" w:hAnsi="Space Grotesk"/>
+                <w:noProof/>
+                <w:webHidden/>
+              </w:rPr>
+            </w:r>
+            <w:r>
+              <w:rPr>
+                <w:rFonts w:ascii="Space Grotesk" w:hAnsi="Space Grotesk"/>
+                <w:noProof/>
+                <w:webHidden/>
+              </w:rPr>
+              <w:fldChar w:fldCharType="separate"/>
+            </w:r>
+            <w:r>
+              <w:rPr>
+                <w:rFonts w:ascii="Space Grotesk" w:hAnsi="Space Grotesk"/>
+                <w:noProof/>
+                <w:webHidden/>
+              </w:rPr>
+              <w:t>6</w:t>
+            </w:r>
+            <w:r>
+              <w:rPr>
+                <w:rFonts w:ascii="Space Grotesk" w:hAnsi="Space Grotesk"/>
+                <w:noProof/>
+                <w:webHidden/>
+              </w:rPr>
+              <w:fldChar w:fldCharType="end"/>
+            </w:r>
+          </w:hyperlink>
+        </w:p>
+        <w:p>
+          <w:r>
+            <w:rPr>
+              <w:rFonts w:ascii="Space Grotesk" w:hAnsi="Space Grotesk"/>
+              <w:b/>
+              <w:bCs/>
+            </w:rPr>
+            <w:fldChar w:fldCharType="end"/>
+          </w:r>
+        </w:p>
+      </w:sdtContent>
+    </w:sdt>
     <w:p>
       <w:pPr>
         <w:jc w:val="both"/>
@@ -639,18 +1403,22 @@
         <w:pStyle w:val="PSITitle"/>
         <w:spacing w:before="0"/>
       </w:pPr>
+      <w:bookmarkStart w:id="0" w:name="_Toc230204254"/>
       <w:r>
         <w:lastRenderedPageBreak/>
         <w:t>Uvod</w:t>
       </w:r>
+      <w:bookmarkEnd w:id="0"/>
     </w:p>
     <w:p>
       <w:pPr>
         <w:pStyle w:val="PSISubtitle"/>
       </w:pPr>
+      <w:bookmarkStart w:id="1" w:name="_Toc230204255"/>
       <w:r>
         <w:t>Rezime</w:t>
       </w:r>
+      <w:bookmarkEnd w:id="1"/>
     </w:p>
     <w:p>
       <w:pPr>
@@ -664,9 +1432,11 @@
       <w:pPr>
         <w:pStyle w:val="PSISubtitle"/>
       </w:pPr>
+      <w:bookmarkStart w:id="2" w:name="_Toc230204256"/>
       <w:r>
         <w:t>Namena dokumenta i ciljne grupe</w:t>
       </w:r>
+      <w:bookmarkEnd w:id="2"/>
     </w:p>
     <w:p>
       <w:pPr>
@@ -680,9 +1450,11 @@
       <w:pPr>
         <w:pStyle w:val="PSISubtitle"/>
       </w:pPr>
+      <w:bookmarkStart w:id="3" w:name="_Toc230204257"/>
       <w:r>
         <w:t>Reference</w:t>
       </w:r>
+      <w:bookmarkEnd w:id="3"/>
     </w:p>
     <w:p>
       <w:pPr>
@@ -736,9 +1508,11 @@
       <w:pPr>
         <w:pStyle w:val="PSISubtitle"/>
       </w:pPr>
+      <w:bookmarkStart w:id="4" w:name="_Toc230204258"/>
       <w:r>
         <w:t>Otvorena pitanja</w:t>
       </w:r>
+      <w:bookmarkEnd w:id="4"/>
     </w:p>
     <w:tbl>
       <w:tblPr>
@@ -957,17 +1731,21 @@
       <w:pPr>
         <w:pStyle w:val="PSITitle"/>
       </w:pPr>
+      <w:bookmarkStart w:id="5" w:name="_Toc230204259"/>
       <w:r>
         <w:t>Scenario pretrage</w:t>
       </w:r>
+      <w:bookmarkEnd w:id="5"/>
     </w:p>
     <w:p>
       <w:pPr>
         <w:pStyle w:val="PSISubtitle"/>
       </w:pPr>
+      <w:bookmarkStart w:id="6" w:name="_Toc230204260"/>
       <w:r>
         <w:t>Kratak opis</w:t>
       </w:r>
+      <w:bookmarkEnd w:id="6"/>
     </w:p>
     <w:p>
       <w:pPr>
@@ -981,10 +1759,12 @@
       <w:pPr>
         <w:pStyle w:val="PSISubtitle"/>
       </w:pPr>
+      <w:bookmarkStart w:id="7" w:name="_Toc230204261"/>
       <w:r>
         <w:lastRenderedPageBreak/>
         <w:t>Tok događaja</w:t>
       </w:r>
+      <w:bookmarkEnd w:id="7"/>
     </w:p>
     <w:p>
       <w:pPr>
@@ -1003,8 +1783,13 @@
         </w:numPr>
       </w:pPr>
       <w:r>
-        <w:t xml:space="preserve"> Korisnik uspešno pretražuje hakathone i primenjuje filtere</w:t>
-      </w:r>
+        <w:t xml:space="preserve"> </w:t>
+      </w:r>
+      <w:bookmarkStart w:id="8" w:name="_Toc230204262"/>
+      <w:r>
+        <w:t>Korisnik uspešno pretražuje hakathone i primenjuje filtere</w:t>
+      </w:r>
+      <w:bookmarkEnd w:id="8"/>
     </w:p>
     <w:p>
       <w:pPr>
@@ -1087,8 +1872,13 @@
         </w:numPr>
       </w:pPr>
       <w:r>
-        <w:t xml:space="preserve"> Korisnik pretražuje članove po veštinama i istoriji učešća</w:t>
-      </w:r>
+        <w:t xml:space="preserve"> </w:t>
+      </w:r>
+      <w:bookmarkStart w:id="9" w:name="_Toc230204263"/>
+      <w:r>
+        <w:t>Korisnik pretražuje članove po veštinama i istoriji učešća</w:t>
+      </w:r>
+      <w:bookmarkEnd w:id="9"/>
     </w:p>
     <w:p>
       <w:pPr>
@@ -1159,8 +1949,13 @@
         </w:numPr>
       </w:pPr>
       <w:r>
-        <w:t xml:space="preserve"> Korisnik pretražuje organizacije</w:t>
-      </w:r>
+        <w:t xml:space="preserve"> </w:t>
+      </w:r>
+      <w:bookmarkStart w:id="10" w:name="_Toc230204264"/>
+      <w:r>
+        <w:t>Korisnik pretražuje organizacije</w:t>
+      </w:r>
+      <w:bookmarkEnd w:id="10"/>
     </w:p>
     <w:p>
       <w:pPr>
@@ -1208,7 +2003,11 @@
       </w:pPr>
       <w:r>
         <w:lastRenderedPageBreak/>
-        <w:t xml:space="preserve"> Pretraga ne vra</w:t>
+        <w:t xml:space="preserve"> </w:t>
+      </w:r>
+      <w:bookmarkStart w:id="11" w:name="_Toc230204265"/>
+      <w:r>
+        <w:t>Pretraga ne vra</w:t>
       </w:r>
       <w:r>
         <w:t>ć</w:t>
@@ -1216,6 +2015,7 @@
       <w:r>
         <w:t>a rezultate</w:t>
       </w:r>
+      <w:bookmarkEnd w:id="11"/>
     </w:p>
     <w:p>
       <w:pPr>
@@ -1272,9 +2072,11 @@
       <w:pPr>
         <w:pStyle w:val="PSISubtitle"/>
       </w:pPr>
+      <w:bookmarkStart w:id="12" w:name="_Toc230204266"/>
       <w:r>
         <w:t>Posebni zahtevi</w:t>
       </w:r>
+      <w:bookmarkEnd w:id="12"/>
     </w:p>
     <w:p>
       <w:pPr>
@@ -1304,9 +2106,11 @@
       <w:pPr>
         <w:pStyle w:val="PSISubtitle"/>
       </w:pPr>
+      <w:bookmarkStart w:id="13" w:name="_Toc230204267"/>
       <w:r>
         <w:t>Preduslovi</w:t>
       </w:r>
+      <w:bookmarkEnd w:id="13"/>
     </w:p>
     <w:p>
       <w:pPr>
@@ -1328,9 +2132,11 @@
       <w:pPr>
         <w:pStyle w:val="PSISubtitle"/>
       </w:pPr>
+      <w:bookmarkStart w:id="14" w:name="_Toc230204268"/>
       <w:r>
         <w:t>Posledice</w:t>
       </w:r>
+      <w:bookmarkEnd w:id="14"/>
     </w:p>
     <w:p>
       <w:pPr>
@@ -1378,9 +2184,11 @@
         </w:numPr>
         <w:spacing w:before="0"/>
       </w:pPr>
+      <w:bookmarkStart w:id="15" w:name="_Toc230204269"/>
       <w:r>
         <w:t>Verzije dokumenta</w:t>
       </w:r>
+      <w:bookmarkEnd w:id="15"/>
     </w:p>
     <w:tbl>
       <w:tblPr>

</xml_diff>